<commit_message>
feat: add ISU institutional email and roll number validation rules
</commit_message>
<xml_diff>
--- a/FestConnect_Project_Report.docx
+++ b/FestConnect_Project_Report.docx
@@ -216,7 +216,7 @@
         <w:br/>
         <w:t>• Reactive Seat Management: Real-time live seat counting that decrements immediately upon successful student registration.</w:t>
         <w:br/>
-        <w:t>• Input Validation: Rigorous client-side verification for Student Name, Roll Number, and Institutional Email.</w:t>
+        <w:t>• Institutional Input Validation: Rigorous client-side verification for Student Name, ISU 12-digit Roll Number, and ITM Skills University Email.</w:t>
       </w:r>
     </w:p>
     <w:p>
@@ -247,7 +247,7 @@
         <w:t xml:space="preserve">Why Flutter for Cross-Platform Delivery? </w:t>
       </w:r>
       <w:r>
-        <w:t>A single, unified Dart codebase compiles natively to Web (Chrome), macOS, Android, and iOS. This eliminates the operational overhead of maintaining separate Android (Kotlin) and iOS (Swift) codebases, while Flutter's Skia/Impeller graphics engine guarantees smooth, responsive 60fps card transitions.</w:t>
+        <w:t>A single, unified Dart codebase compiles natively to Web (Chrome), macOS, Android, and iOS. This eliminates the operational overhead of maintaining separate codebases, while Flutter's Skia/Impeller graphics engine guarantees smooth, responsive 60fps card transitions.</w:t>
       </w:r>
     </w:p>
     <w:p>
@@ -608,16 +608,16 @@
     </w:p>
     <w:p>
       <w:r>
-        <w:t>Client-side validation is executed through a GlobalKey&lt;FormState&gt; before any registration is dispatched:</w:t>
+        <w:t>Client-side validation is executed through a GlobalKey&lt;FormState&gt; before any registration is dispatched, customized to ITM Skills University institutional standards:</w:t>
       </w:r>
     </w:p>
     <w:p>
       <w:r>
         <w:t>1. Full Name: Mandatory non-empty check, minimum 2 characters, and alphabetic character enforcement (RegExp: ^[a-zA-Z\s\.\']+$).</w:t>
         <w:br/>
-        <w:t>2. Roll Number: Mandatory format validation checking alphanumeric student ID patterns (RegExp: ^[a-zA-Z0-9\-\/]+$) with length &gt;= 3.</w:t>
+        <w:t>2. Roll Number (12 Digits): Enforces the university prefix 150096724 followed by the student's 3-digit number (RegExp: ^150096724\d{3}$), e.g., 150096724125.</w:t>
         <w:br/>
-        <w:t>3. Email Address: Standard RFC-compliant email regex verification (^[a-zA-Z0-9._%+-]+@[a-zA-Z0-9.-]+\.[a-zA-Z]{2,}$) ensuring valid domain structure.</w:t>
+        <w:t>3. Institutional Email (@isu.ac.in): Strictly checks the college domain and year prefix pattern (RegExp: ^\d{4}\.[a-zA-Z0-9._]+@isu\.ac\.in$), e.g., 2024.manthanb@isu.ac.in.</w:t>
       </w:r>
     </w:p>
     <w:p>
@@ -689,7 +689,7 @@
     </w:p>
     <w:p>
       <w:r>
-        <w:t>FestConnect fulfills all technical and visual criteria outlined in Case Study #7. The clean black-and-white aesthetic, combined with robust named routing, strict form validation, and reactive live-seat tracking, delivers a dependable and modern cross-platform solution ready for academic submission and live demonstration.</w:t>
+        <w:t>FestConnect fulfills all technical and visual criteria outlined in Case Study #7. The clean black-and-white aesthetic, combined with robust named routing, strict institutional form validation, and reactive live-seat tracking, delivers a dependable and modern cross-platform solution ready for academic submission and live demonstration.</w:t>
       </w:r>
     </w:p>
     <w:sectPr>

</xml_diff>